<commit_message>
dijital_tema-3-kim11: gorsel alanlarina Shutter onizlemeleri yerlestirildi (2.3 bicimi)
</commit_message>
<xml_diff>
--- a/dijital/dijital_tema-3-kim11.docx
+++ b/dijital/dijital_tema-3-kim11.docx
@@ -78,77 +78,60 @@
         <w:t xml:space="preserve">Hidrojen yandığında yalnızca su oluşturan, birim kütle başına çok yüksek enerji veren bir enerji taşıyıcısıdır. Yenilenebilir kaynaklardan ve atıklardan elde edilen hidrojene yeşil hidrojen denir. Evsel organik atıklar, oksijensiz ve ışıksız ortamda bazı mikroorganizmalar tarafından fermantasyonla parçalanırken hidrojen gazı üretilebilir. Elde edilen hidrojen miktarı atığın türüne, miktarına, sıcaklığa, pH’a ve mikroorganizma türüne bağlıdır.</w:t>
       </w:r>
     </w:p>
-    <w:tbl>
-      <w:tblPr>
-        <w:tblW w:w="9000" w:type="dxa"/>
+    <w:p>
+      <w:pPr>
         <w:jc w:val="center"/>
-        <w:tblBorders>
-          <w:top w:val="single" w:sz="8" w:space="0" w:color="7F7F7F"/>
-          <w:left w:val="single" w:sz="8" w:space="0" w:color="7F7F7F"/>
-          <w:bottom w:val="single" w:sz="8" w:space="0" w:color="7F7F7F"/>
-          <w:right w:val="single" w:sz="8" w:space="0" w:color="7F7F7F"/>
-        </w:tblBorders>
-      </w:tblPr>
-      <w:tblGrid>
-        <w:gridCol w:w="9000"/>
-      </w:tblGrid>
-      <w:tr>
-        <w:tc>
-          <w:tcPr>
-            <w:tcW w:w="9000" w:type="dxa"/>
-            <w:shd w:val="clear" w:color="auto" w:fill="EDEDED"/>
-          </w:tcPr>
-          <w:p>
-            <w:pPr>
-              <w:jc w:val="both"/>
-              <w:rPr>
-                <w:rFonts w:ascii="Times New Roman" w:hAnsi="Times New Roman" w:cs="Times New Roman"/>
-                <w:lang w:val="tr-TR"/>
-              </w:rPr>
-            </w:pPr>
-            <w:r>
-              <w:rPr>
-                <w:rFonts w:ascii="Times New Roman" w:hAnsi="Times New Roman" w:cs="Times New Roman"/>
-                <w:lang w:val="tr-TR"/>
-              </w:rPr>
-              <w:t xml:space="preserve">GÖRSEL ALANI (Shutterstock)</w:t>
-            </w:r>
-          </w:p>
-          <w:p>
-            <w:pPr>
-              <w:jc w:val="both"/>
-              <w:rPr>
-                <w:rFonts w:ascii="Times New Roman" w:hAnsi="Times New Roman" w:cs="Times New Roman"/>
-                <w:lang w:val="tr-TR"/>
-              </w:rPr>
-            </w:pPr>
-            <w:r>
-              <w:rPr>
-                <w:rFonts w:ascii="Times New Roman" w:hAnsi="Times New Roman" w:cs="Times New Roman"/>
-                <w:lang w:val="tr-TR"/>
-              </w:rPr>
-              <w:t xml:space="preserve">Tarif: Organik atık → fermantasyon tankı → H₂ gazı → yakıt pili / araç akışını gösteren vektörel infografik.</w:t>
-            </w:r>
-          </w:p>
-          <w:p>
-            <w:pPr>
-              <w:jc w:val="both"/>
-              <w:rPr>
-                <w:rFonts w:ascii="Times New Roman" w:hAnsi="Times New Roman" w:cs="Times New Roman"/>
-                <w:lang w:val="tr-TR"/>
-              </w:rPr>
-            </w:pPr>
-            <w:r>
-              <w:rPr>
-                <w:rFonts w:ascii="Times New Roman" w:hAnsi="Times New Roman" w:cs="Times New Roman"/>
-                <w:lang w:val="tr-TR"/>
-              </w:rPr>
-              <w:t xml:space="preserve">Shutter ID: 2253333735 (vektör) — Biofuel production from organic waste (H2 çıktısı olarak düzenlenecek)</w:t>
-            </w:r>
-          </w:p>
-        </w:tc>
-      </w:tr>
-    </w:tbl>
+      </w:pPr>
+      <w:r>
+        <w:drawing>
+          <wp:inline xmlns:a="http://schemas.openxmlformats.org/drawingml/2006/main" xmlns:pic="http://schemas.openxmlformats.org/drawingml/2006/picture">
+            <wp:extent cx="2460937" cy="2519999"/>
+            <wp:docPr id="2" name="Picture 2"/>
+            <wp:cNvGraphicFramePr>
+              <a:graphicFrameLocks noChangeAspect="1"/>
+            </wp:cNvGraphicFramePr>
+            <a:graphic>
+              <a:graphicData uri="http://schemas.openxmlformats.org/drawingml/2006/picture">
+                <pic:pic>
+                  <pic:nvPicPr>
+                    <pic:cNvPr id="0" name="2253333735_d.jpg"/>
+                    <pic:cNvPicPr/>
+                  </pic:nvPicPr>
+                  <pic:blipFill>
+                    <a:blip r:embed="rId12"/>
+                    <a:stretch>
+                      <a:fillRect/>
+                    </a:stretch>
+                  </pic:blipFill>
+                  <pic:spPr>
+                    <a:xfrm>
+                      <a:off x="0" y="0"/>
+                      <a:ext cx="2460937" cy="2519999"/>
+                    </a:xfrm>
+                    <a:prstGeom prst="rect"/>
+                  </pic:spPr>
+                </pic:pic>
+              </a:graphicData>
+            </a:graphic>
+          </wp:inline>
+        </w:drawing>
+      </w:r>
+    </w:p>
+    <w:p>
+      <w:pPr>
+        <w:jc w:val="center"/>
+      </w:pPr>
+      <w:r>
+        <w:rPr>
+          <w:rFonts w:ascii="Times New Roman" w:hAnsi="Times New Roman" w:cs="Times New Roman"/>
+          <w:b/>
+          <w:bCs/>
+          <w:highlight w:val="yellow"/>
+          <w:lang w:val="tr-TR"/>
+        </w:rPr>
+        <w:t xml:space="preserve">Shutter id: 2253333735</w:t>
+      </w:r>
+    </w:p>
     <w:p>
       <w:r>
         <w:rPr>

</xml_diff>